<commit_message>
Embed initial screenshots (Langkah 1, 2, and 4) into Task 4 Word report document
</commit_message>
<xml_diff>
--- a/Portfolio WP2/4_Unjuk_Kerja Membuat Dokumen Kode Program - Nugraha Jody.docx
+++ b/Portfolio WP2/4_Unjuk_Kerja Membuat Dokumen Kode Program - Nugraha Jody.docx
@@ -164,13 +164,38 @@
         <w:jc w:val="center"/>
       </w:pPr>
       <w:r>
-        <w:rPr>
-          <w:rFonts w:ascii="Arial" w:hAnsi="Arial"/>
-          <w:b/>
-          <w:color w:val="EF4444"/>
-          <w:sz w:val="22"/>
-        </w:rPr>
-        <w:t>[ TEMPEL SCREENSHOT: TEMPEL SCREENSHOT KODE VS CODE YANG MENUNJUKKAN PENGGUNAAN KOMENTAR PADA MODEL/CONTROLLER DI SINI ]</w:t>
+        <w:drawing>
+          <wp:inline xmlns:a="http://schemas.openxmlformats.org/drawingml/2006/main" xmlns:pic="http://schemas.openxmlformats.org/drawingml/2006/picture">
+            <wp:extent cx="4754880" cy="2549247"/>
+            <wp:docPr id="1" name="Picture 1"/>
+            <wp:cNvGraphicFramePr>
+              <a:graphicFrameLocks noChangeAspect="1"/>
+            </wp:cNvGraphicFramePr>
+            <a:graphic>
+              <a:graphicData uri="http://schemas.openxmlformats.org/drawingml/2006/picture">
+                <pic:pic>
+                  <pic:nvPicPr>
+                    <pic:cNvPr id="0" name="media__1783247525726.png"/>
+                    <pic:cNvPicPr/>
+                  </pic:nvPicPr>
+                  <pic:blipFill>
+                    <a:blip r:embed="rId9"/>
+                    <a:stretch>
+                      <a:fillRect/>
+                    </a:stretch>
+                  </pic:blipFill>
+                  <pic:spPr>
+                    <a:xfrm>
+                      <a:off x="0" y="0"/>
+                      <a:ext cx="4754880" cy="2549247"/>
+                    </a:xfrm>
+                    <a:prstGeom prst="rect"/>
+                  </pic:spPr>
+                </pic:pic>
+              </a:graphicData>
+            </a:graphic>
+          </wp:inline>
+        </w:drawing>
       </w:r>
     </w:p>
     <w:p>
@@ -182,10 +207,10 @@
         <w:rPr>
           <w:rFonts w:ascii="Arial" w:hAnsi="Arial"/>
           <w:i/>
-          <w:color w:val="94A3B8"/>
+          <w:color w:val="64748B"/>
           <w:sz w:val="18"/>
         </w:rPr>
-        <w:t>(Silakan ambil screenshot dari kodingan atau browser lokal, lalu tempel di atas)</w:t>
+        <w:t>(Screenshot Output Program untuk Penggunaan Komentar pada Kode Program)</w:t>
       </w:r>
     </w:p>
     <w:p>
@@ -285,13 +310,38 @@
         <w:jc w:val="center"/>
       </w:pPr>
       <w:r>
-        <w:rPr>
-          <w:rFonts w:ascii="Arial" w:hAnsi="Arial"/>
-          <w:b/>
-          <w:color w:val="EF4444"/>
-          <w:sz w:val="22"/>
-        </w:rPr>
-        <w:t>[ TEMPEL SCREENSHOT: TEMPEL SCREENSHOT ISI FILE MODEL BOOKING.PHP DI EDITOR VS CODE DI SINI ]</w:t>
+        <w:drawing>
+          <wp:inline xmlns:a="http://schemas.openxmlformats.org/drawingml/2006/main" xmlns:pic="http://schemas.openxmlformats.org/drawingml/2006/picture">
+            <wp:extent cx="4754880" cy="2553891"/>
+            <wp:docPr id="2" name="Picture 2"/>
+            <wp:cNvGraphicFramePr>
+              <a:graphicFrameLocks noChangeAspect="1"/>
+            </wp:cNvGraphicFramePr>
+            <a:graphic>
+              <a:graphicData uri="http://schemas.openxmlformats.org/drawingml/2006/picture">
+                <pic:pic>
+                  <pic:nvPicPr>
+                    <pic:cNvPr id="0" name="media__1783247474880.png"/>
+                    <pic:cNvPicPr/>
+                  </pic:nvPicPr>
+                  <pic:blipFill>
+                    <a:blip r:embed="rId10"/>
+                    <a:stretch>
+                      <a:fillRect/>
+                    </a:stretch>
+                  </pic:blipFill>
+                  <pic:spPr>
+                    <a:xfrm>
+                      <a:off x="0" y="0"/>
+                      <a:ext cx="4754880" cy="2553891"/>
+                    </a:xfrm>
+                    <a:prstGeom prst="rect"/>
+                  </pic:spPr>
+                </pic:pic>
+              </a:graphicData>
+            </a:graphic>
+          </wp:inline>
+        </w:drawing>
       </w:r>
     </w:p>
     <w:p>
@@ -303,10 +353,10 @@
         <w:rPr>
           <w:rFonts w:ascii="Arial" w:hAnsi="Arial"/>
           <w:i/>
-          <w:color w:val="94A3B8"/>
+          <w:color w:val="64748B"/>
           <w:sz w:val="18"/>
         </w:rPr>
-        <w:t>(Silakan ambil screenshot dari kodingan atau browser lokal, lalu tempel di atas)</w:t>
+        <w:t>(Screenshot Output Program untuk Pembuatan Model Transaksi (Booking))</w:t>
       </w:r>
     </w:p>
     <w:p>
@@ -539,13 +589,38 @@
         <w:jc w:val="center"/>
       </w:pPr>
       <w:r>
-        <w:rPr>
-          <w:rFonts w:ascii="Arial" w:hAnsi="Arial"/>
-          <w:b/>
-          <w:color w:val="EF4444"/>
-          <w:sz w:val="22"/>
-        </w:rPr>
-        <w:t>[ TEMPEL SCREENSHOT: TEMPEL SCREENSHOT FILE WORKSHOPCONTROLLER.PHP PADA METHOD INDEX() DI VS CODE DI SINI ]</w:t>
+        <w:drawing>
+          <wp:inline xmlns:a="http://schemas.openxmlformats.org/drawingml/2006/main" xmlns:pic="http://schemas.openxmlformats.org/drawingml/2006/picture">
+            <wp:extent cx="4754880" cy="2558534"/>
+            <wp:docPr id="3" name="Picture 3"/>
+            <wp:cNvGraphicFramePr>
+              <a:graphicFrameLocks noChangeAspect="1"/>
+            </wp:cNvGraphicFramePr>
+            <a:graphic>
+              <a:graphicData uri="http://schemas.openxmlformats.org/drawingml/2006/picture">
+                <pic:pic>
+                  <pic:nvPicPr>
+                    <pic:cNvPr id="0" name="media__1783247573055.png"/>
+                    <pic:cNvPicPr/>
+                  </pic:nvPicPr>
+                  <pic:blipFill>
+                    <a:blip r:embed="rId11"/>
+                    <a:stretch>
+                      <a:fillRect/>
+                    </a:stretch>
+                  </pic:blipFill>
+                  <pic:spPr>
+                    <a:xfrm>
+                      <a:off x="0" y="0"/>
+                      <a:ext cx="4754880" cy="2558534"/>
+                    </a:xfrm>
+                    <a:prstGeom prst="rect"/>
+                  </pic:spPr>
+                </pic:pic>
+              </a:graphicData>
+            </a:graphic>
+          </wp:inline>
+        </w:drawing>
       </w:r>
     </w:p>
     <w:p>
@@ -557,10 +632,10 @@
         <w:rPr>
           <w:rFonts w:ascii="Arial" w:hAnsi="Arial"/>
           <w:i/>
-          <w:color w:val="94A3B8"/>
+          <w:color w:val="64748B"/>
           <w:sz w:val="18"/>
         </w:rPr>
-        <w:t>(Silakan ambil screenshot dari kodingan atau browser lokal, lalu tempel di atas)</w:t>
+        <w:t>(Screenshot Output Program untuk Fungsi index() pada Controller)</w:t>
       </w:r>
     </w:p>
     <w:p>
@@ -710,7 +785,7 @@
           <w:color w:val="0F172A"/>
           <w:sz w:val="25"/>
         </w:rPr>
-        <w:t>Langkah 6: Fungsi store() pada Controller</w:t>
+        <w:t>Langkah 6: Fungsi store() pada Controller (bookingCustomer)</w:t>
       </w:r>
     </w:p>
     <w:p>

</xml_diff>

<commit_message>
Embed store screenshot into Task 4 Word report document
</commit_message>
<xml_diff>
--- a/Portfolio WP2/4_Unjuk_Kerja Membuat Dokumen Kode Program - Nugraha Jody.docx
+++ b/Portfolio WP2/4_Unjuk_Kerja Membuat Dokumen Kode Program - Nugraha Jody.docx
@@ -872,13 +872,38 @@
         <w:jc w:val="center"/>
       </w:pPr>
       <w:r>
-        <w:rPr>
-          <w:rFonts w:ascii="Arial" w:hAnsi="Arial"/>
-          <w:b/>
-          <w:color w:val="EF4444"/>
-          <w:sz w:val="22"/>
-        </w:rPr>
-        <w:t>[ TEMPEL SCREENSHOT: TEMPEL SCREENSHOT FILE WORKSHOPCONTROLLER.PHP PADA METHOD BOOKINGCUSTOMER() / STORE() DI VS CODE DI SINI ]</w:t>
+        <w:drawing>
+          <wp:inline xmlns:a="http://schemas.openxmlformats.org/drawingml/2006/main" xmlns:pic="http://schemas.openxmlformats.org/drawingml/2006/picture">
+            <wp:extent cx="4754880" cy="2544604"/>
+            <wp:docPr id="4" name="Picture 4"/>
+            <wp:cNvGraphicFramePr>
+              <a:graphicFrameLocks noChangeAspect="1"/>
+            </wp:cNvGraphicFramePr>
+            <a:graphic>
+              <a:graphicData uri="http://schemas.openxmlformats.org/drawingml/2006/picture">
+                <pic:pic>
+                  <pic:nvPicPr>
+                    <pic:cNvPr id="0" name="media__1783248098664.png"/>
+                    <pic:cNvPicPr/>
+                  </pic:nvPicPr>
+                  <pic:blipFill>
+                    <a:blip r:embed="rId12"/>
+                    <a:stretch>
+                      <a:fillRect/>
+                    </a:stretch>
+                  </pic:blipFill>
+                  <pic:spPr>
+                    <a:xfrm>
+                      <a:off x="0" y="0"/>
+                      <a:ext cx="4754880" cy="2544604"/>
+                    </a:xfrm>
+                    <a:prstGeom prst="rect"/>
+                  </pic:spPr>
+                </pic:pic>
+              </a:graphicData>
+            </a:graphic>
+          </wp:inline>
+        </w:drawing>
       </w:r>
     </w:p>
     <w:p>
@@ -890,10 +915,10 @@
         <w:rPr>
           <w:rFonts w:ascii="Arial" w:hAnsi="Arial"/>
           <w:i/>
-          <w:color w:val="94A3B8"/>
+          <w:color w:val="64748B"/>
           <w:sz w:val="18"/>
         </w:rPr>
-        <w:t>(Silakan ambil screenshot dari kodingan atau browser lokal, lalu tempel di atas)</w:t>
+        <w:t>(Screenshot Output Program untuk Fungsi store() pada Controller (bookingCustomer))</w:t>
       </w:r>
     </w:p>
     <w:p>

</xml_diff>

<commit_message>
Embed update screenshot into Task 4 Word report document
</commit_message>
<xml_diff>
--- a/Portfolio WP2/4_Unjuk_Kerja Membuat Dokumen Kode Program - Nugraha Jody.docx
+++ b/Portfolio WP2/4_Unjuk_Kerja Membuat Dokumen Kode Program - Nugraha Jody.docx
@@ -1153,13 +1153,38 @@
         <w:jc w:val="center"/>
       </w:pPr>
       <w:r>
-        <w:rPr>
-          <w:rFonts w:ascii="Arial" w:hAnsi="Arial"/>
-          <w:b/>
-          <w:color w:val="EF4444"/>
-          <w:sz w:val="22"/>
-        </w:rPr>
-        <w:t>[ TEMPEL SCREENSHOT: TEMPEL SCREENSHOT METHOD UPDATESTATUS() / UPDATE() DI WORKSHOPCONTROLLER.PHP DI VS CODE DI SINI ]</w:t>
+        <w:drawing>
+          <wp:inline xmlns:a="http://schemas.openxmlformats.org/drawingml/2006/main" xmlns:pic="http://schemas.openxmlformats.org/drawingml/2006/picture">
+            <wp:extent cx="4754880" cy="2558534"/>
+            <wp:docPr id="5" name="Picture 5"/>
+            <wp:cNvGraphicFramePr>
+              <a:graphicFrameLocks noChangeAspect="1"/>
+            </wp:cNvGraphicFramePr>
+            <a:graphic>
+              <a:graphicData uri="http://schemas.openxmlformats.org/drawingml/2006/picture">
+                <pic:pic>
+                  <pic:nvPicPr>
+                    <pic:cNvPr id="0" name="media__1783248360614.png"/>
+                    <pic:cNvPicPr/>
+                  </pic:nvPicPr>
+                  <pic:blipFill>
+                    <a:blip r:embed="rId13"/>
+                    <a:stretch>
+                      <a:fillRect/>
+                    </a:stretch>
+                  </pic:blipFill>
+                  <pic:spPr>
+                    <a:xfrm>
+                      <a:off x="0" y="0"/>
+                      <a:ext cx="4754880" cy="2558534"/>
+                    </a:xfrm>
+                    <a:prstGeom prst="rect"/>
+                  </pic:spPr>
+                </pic:pic>
+              </a:graphicData>
+            </a:graphic>
+          </wp:inline>
+        </w:drawing>
       </w:r>
     </w:p>
     <w:p>
@@ -1171,10 +1196,10 @@
         <w:rPr>
           <w:rFonts w:ascii="Arial" w:hAnsi="Arial"/>
           <w:i/>
-          <w:color w:val="94A3B8"/>
+          <w:color w:val="64748B"/>
           <w:sz w:val="18"/>
         </w:rPr>
-        <w:t>(Silakan ambil screenshot dari kodingan atau browser lokal, lalu tempel di atas)</w:t>
+        <w:t>(Screenshot Output Program untuk Fungsi update() pada Controller)</w:t>
       </w:r>
     </w:p>
     <w:p>

</xml_diff>

<commit_message>
Embed show/cetakPDF screenshot into Task 4 Word report document
</commit_message>
<xml_diff>
--- a/Portfolio WP2/4_Unjuk_Kerja Membuat Dokumen Kode Program - Nugraha Jody.docx
+++ b/Portfolio WP2/4_Unjuk_Kerja Membuat Dokumen Kode Program - Nugraha Jody.docx
@@ -1349,7 +1349,7 @@
           <w:color w:val="0F172A"/>
           <w:sz w:val="25"/>
         </w:rPr>
-        <w:t>Langkah 10: Fungsi show() pada Controller</w:t>
+        <w:t>Langkah 10: Fungsi show() pada Controller (cetakPDF)</w:t>
       </w:r>
     </w:p>
     <w:p>
@@ -1430,13 +1430,38 @@
         <w:jc w:val="center"/>
       </w:pPr>
       <w:r>
-        <w:rPr>
-          <w:rFonts w:ascii="Arial" w:hAnsi="Arial"/>
-          <w:b/>
-          <w:color w:val="EF4444"/>
-          <w:sz w:val="22"/>
-        </w:rPr>
-        <w:t>[ TEMPEL SCREENSHOT: TEMPEL SCREENSHOT METHOD SHOWBOOKING() / SHOW() / CETAKPDF() DI WORKSHOPCONTROLLER.PHP DI VS CODE DI SINI ]</w:t>
+        <w:drawing>
+          <wp:inline xmlns:a="http://schemas.openxmlformats.org/drawingml/2006/main" xmlns:pic="http://schemas.openxmlformats.org/drawingml/2006/picture">
+            <wp:extent cx="4754880" cy="2563178"/>
+            <wp:docPr id="6" name="Picture 6"/>
+            <wp:cNvGraphicFramePr>
+              <a:graphicFrameLocks noChangeAspect="1"/>
+            </wp:cNvGraphicFramePr>
+            <a:graphic>
+              <a:graphicData uri="http://schemas.openxmlformats.org/drawingml/2006/picture">
+                <pic:pic>
+                  <pic:nvPicPr>
+                    <pic:cNvPr id="0" name="media__1783248591401.png"/>
+                    <pic:cNvPicPr/>
+                  </pic:nvPicPr>
+                  <pic:blipFill>
+                    <a:blip r:embed="rId14"/>
+                    <a:stretch>
+                      <a:fillRect/>
+                    </a:stretch>
+                  </pic:blipFill>
+                  <pic:spPr>
+                    <a:xfrm>
+                      <a:off x="0" y="0"/>
+                      <a:ext cx="4754880" cy="2563178"/>
+                    </a:xfrm>
+                    <a:prstGeom prst="rect"/>
+                  </pic:spPr>
+                </pic:pic>
+              </a:graphicData>
+            </a:graphic>
+          </wp:inline>
+        </w:drawing>
       </w:r>
     </w:p>
     <w:p>
@@ -1448,10 +1473,10 @@
         <w:rPr>
           <w:rFonts w:ascii="Arial" w:hAnsi="Arial"/>
           <w:i/>
-          <w:color w:val="94A3B8"/>
+          <w:color w:val="64748B"/>
           <w:sz w:val="18"/>
         </w:rPr>
-        <w:t>(Silakan ambil screenshot dari kodingan atau browser lokal, lalu tempel di atas)</w:t>
+        <w:t>(Screenshot Output Program untuk Fungsi show() pada Controller (cetakPDF))</w:t>
       </w:r>
     </w:p>
     <w:sectPr>

</xml_diff>

<commit_message>
Embed browser screenshots (Langkah 3, 5, and 7) into Task 4 Word report document
</commit_message>
<xml_diff>
--- a/Portfolio WP2/4_Unjuk_Kerja Membuat Dokumen Kode Program - Nugraha Jody.docx
+++ b/Portfolio WP2/4_Unjuk_Kerja Membuat Dokumen Kode Program - Nugraha Jody.docx
@@ -464,13 +464,38 @@
         <w:jc w:val="center"/>
       </w:pPr>
       <w:r>
-        <w:rPr>
-          <w:rFonts w:ascii="Arial" w:hAnsi="Arial"/>
-          <w:b/>
-          <w:color w:val="EF4444"/>
-          <w:sz w:val="22"/>
-        </w:rPr>
-        <w:t>[ TEMPEL SCREENSHOT: TEMPEL SCREENSHOT HALAMAN TABEL DAFTAR BOOKING SERVIS DI BROWSER DI SINI ]</w:t>
+        <w:drawing>
+          <wp:inline xmlns:a="http://schemas.openxmlformats.org/drawingml/2006/main" xmlns:pic="http://schemas.openxmlformats.org/drawingml/2006/picture">
+            <wp:extent cx="4754880" cy="2544604"/>
+            <wp:docPr id="3" name="Picture 3"/>
+            <wp:cNvGraphicFramePr>
+              <a:graphicFrameLocks noChangeAspect="1"/>
+            </wp:cNvGraphicFramePr>
+            <a:graphic>
+              <a:graphicData uri="http://schemas.openxmlformats.org/drawingml/2006/picture">
+                <pic:pic>
+                  <pic:nvPicPr>
+                    <pic:cNvPr id="0" name="media__1783248761336.png"/>
+                    <pic:cNvPicPr/>
+                  </pic:nvPicPr>
+                  <pic:blipFill>
+                    <a:blip r:embed="rId11"/>
+                    <a:stretch>
+                      <a:fillRect/>
+                    </a:stretch>
+                  </pic:blipFill>
+                  <pic:spPr>
+                    <a:xfrm>
+                      <a:off x="0" y="0"/>
+                      <a:ext cx="4754880" cy="2544604"/>
+                    </a:xfrm>
+                    <a:prstGeom prst="rect"/>
+                  </pic:spPr>
+                </pic:pic>
+              </a:graphicData>
+            </a:graphic>
+          </wp:inline>
+        </w:drawing>
       </w:r>
     </w:p>
     <w:p>
@@ -482,10 +507,10 @@
         <w:rPr>
           <w:rFonts w:ascii="Arial" w:hAnsi="Arial"/>
           <w:i/>
-          <w:color w:val="94A3B8"/>
+          <w:color w:val="64748B"/>
           <w:sz w:val="18"/>
         </w:rPr>
-        <w:t>(Silakan ambil screenshot dari kodingan atau browser lokal, lalu tempel di atas)</w:t>
+        <w:t>(Screenshot Output Program untuk Pembuatan View Index Transaksi (dashboard.blade.php))</w:t>
       </w:r>
     </w:p>
     <w:p>
@@ -592,7 +617,7 @@
         <w:drawing>
           <wp:inline xmlns:a="http://schemas.openxmlformats.org/drawingml/2006/main" xmlns:pic="http://schemas.openxmlformats.org/drawingml/2006/picture">
             <wp:extent cx="4754880" cy="2558534"/>
-            <wp:docPr id="3" name="Picture 3"/>
+            <wp:docPr id="4" name="Picture 4"/>
             <wp:cNvGraphicFramePr>
               <a:graphicFrameLocks noChangeAspect="1"/>
             </wp:cNvGraphicFramePr>
@@ -604,7 +629,7 @@
                     <pic:cNvPicPr/>
                   </pic:nvPicPr>
                   <pic:blipFill>
-                    <a:blip r:embed="rId11"/>
+                    <a:blip r:embed="rId12"/>
                     <a:stretch>
                       <a:fillRect/>
                     </a:stretch>
@@ -741,13 +766,38 @@
         <w:jc w:val="center"/>
       </w:pPr>
       <w:r>
-        <w:rPr>
-          <w:rFonts w:ascii="Arial" w:hAnsi="Arial"/>
-          <w:b/>
-          <w:color w:val="EF4444"/>
-          <w:sz w:val="22"/>
-        </w:rPr>
-        <w:t>[ TEMPEL SCREENSHOT: TEMPEL SCREENSHOT FORM BOOKING SERVIS DI BROWSER LOKAL KAMU DI SINI ]</w:t>
+        <w:drawing>
+          <wp:inline xmlns:a="http://schemas.openxmlformats.org/drawingml/2006/main" xmlns:pic="http://schemas.openxmlformats.org/drawingml/2006/picture">
+            <wp:extent cx="4754880" cy="2669977"/>
+            <wp:docPr id="5" name="Picture 5"/>
+            <wp:cNvGraphicFramePr>
+              <a:graphicFrameLocks noChangeAspect="1"/>
+            </wp:cNvGraphicFramePr>
+            <a:graphic>
+              <a:graphicData uri="http://schemas.openxmlformats.org/drawingml/2006/picture">
+                <pic:pic>
+                  <pic:nvPicPr>
+                    <pic:cNvPr id="0" name="media__1783248856738.png"/>
+                    <pic:cNvPicPr/>
+                  </pic:nvPicPr>
+                  <pic:blipFill>
+                    <a:blip r:embed="rId13"/>
+                    <a:stretch>
+                      <a:fillRect/>
+                    </a:stretch>
+                  </pic:blipFill>
+                  <pic:spPr>
+                    <a:xfrm>
+                      <a:off x="0" y="0"/>
+                      <a:ext cx="4754880" cy="2669977"/>
+                    </a:xfrm>
+                    <a:prstGeom prst="rect"/>
+                  </pic:spPr>
+                </pic:pic>
+              </a:graphicData>
+            </a:graphic>
+          </wp:inline>
+        </w:drawing>
       </w:r>
     </w:p>
     <w:p>
@@ -759,10 +809,10 @@
         <w:rPr>
           <w:rFonts w:ascii="Arial" w:hAnsi="Arial"/>
           <w:i/>
-          <w:color w:val="94A3B8"/>
+          <w:color w:val="64748B"/>
           <w:sz w:val="18"/>
         </w:rPr>
-        <w:t>(Silakan ambil screenshot dari kodingan atau browser lokal, lalu tempel di atas)</w:t>
+        <w:t>(Screenshot Output Program untuk Pembuatan View Create Transaksi (booking.blade.php))</w:t>
       </w:r>
     </w:p>
     <w:p>
@@ -875,7 +925,7 @@
         <w:drawing>
           <wp:inline xmlns:a="http://schemas.openxmlformats.org/drawingml/2006/main" xmlns:pic="http://schemas.openxmlformats.org/drawingml/2006/picture">
             <wp:extent cx="4754880" cy="2544604"/>
-            <wp:docPr id="4" name="Picture 4"/>
+            <wp:docPr id="6" name="Picture 6"/>
             <wp:cNvGraphicFramePr>
               <a:graphicFrameLocks noChangeAspect="1"/>
             </wp:cNvGraphicFramePr>
@@ -887,7 +937,7 @@
                     <pic:cNvPicPr/>
                   </pic:nvPicPr>
                   <pic:blipFill>
-                    <a:blip r:embed="rId12"/>
+                    <a:blip r:embed="rId14"/>
                     <a:stretch>
                       <a:fillRect/>
                     </a:stretch>
@@ -1026,13 +1076,38 @@
         <w:jc w:val="center"/>
       </w:pPr>
       <w:r>
-        <w:rPr>
-          <w:rFonts w:ascii="Arial" w:hAnsi="Arial"/>
-          <w:b/>
-          <w:color w:val="EF4444"/>
-          <w:sz w:val="22"/>
-        </w:rPr>
-        <w:t>[ TEMPEL SCREENSHOT: TEMPEL SCREENSHOT MODAL/TAMPILAN FORM UBAH STATUS SERVIS DI BROWSER DI SINI ]</w:t>
+        <w:drawing>
+          <wp:inline xmlns:a="http://schemas.openxmlformats.org/drawingml/2006/main" xmlns:pic="http://schemas.openxmlformats.org/drawingml/2006/picture">
+            <wp:extent cx="4754880" cy="2498169"/>
+            <wp:docPr id="7" name="Picture 7"/>
+            <wp:cNvGraphicFramePr>
+              <a:graphicFrameLocks noChangeAspect="1"/>
+            </wp:cNvGraphicFramePr>
+            <a:graphic>
+              <a:graphicData uri="http://schemas.openxmlformats.org/drawingml/2006/picture">
+                <pic:pic>
+                  <pic:nvPicPr>
+                    <pic:cNvPr id="0" name="media__1783248903524.png"/>
+                    <pic:cNvPicPr/>
+                  </pic:nvPicPr>
+                  <pic:blipFill>
+                    <a:blip r:embed="rId15"/>
+                    <a:stretch>
+                      <a:fillRect/>
+                    </a:stretch>
+                  </pic:blipFill>
+                  <pic:spPr>
+                    <a:xfrm>
+                      <a:off x="0" y="0"/>
+                      <a:ext cx="4754880" cy="2498169"/>
+                    </a:xfrm>
+                    <a:prstGeom prst="rect"/>
+                  </pic:spPr>
+                </pic:pic>
+              </a:graphicData>
+            </a:graphic>
+          </wp:inline>
+        </w:drawing>
       </w:r>
     </w:p>
     <w:p>
@@ -1044,10 +1119,10 @@
         <w:rPr>
           <w:rFonts w:ascii="Arial" w:hAnsi="Arial"/>
           <w:i/>
-          <w:color w:val="94A3B8"/>
+          <w:color w:val="64748B"/>
           <w:sz w:val="18"/>
         </w:rPr>
-        <w:t>(Silakan ambil screenshot dari kodingan atau browser lokal, lalu tempel di atas)</w:t>
+        <w:t>(Screenshot Output Program untuk Pembuatan View Edit Transaksi (Status Servis))</w:t>
       </w:r>
     </w:p>
     <w:p>
@@ -1156,7 +1231,7 @@
         <w:drawing>
           <wp:inline xmlns:a="http://schemas.openxmlformats.org/drawingml/2006/main" xmlns:pic="http://schemas.openxmlformats.org/drawingml/2006/picture">
             <wp:extent cx="4754880" cy="2558534"/>
-            <wp:docPr id="5" name="Picture 5"/>
+            <wp:docPr id="8" name="Picture 8"/>
             <wp:cNvGraphicFramePr>
               <a:graphicFrameLocks noChangeAspect="1"/>
             </wp:cNvGraphicFramePr>
@@ -1168,7 +1243,7 @@
                     <pic:cNvPicPr/>
                   </pic:nvPicPr>
                   <pic:blipFill>
-                    <a:blip r:embed="rId13"/>
+                    <a:blip r:embed="rId16"/>
                     <a:stretch>
                       <a:fillRect/>
                     </a:stretch>
@@ -1433,7 +1508,7 @@
         <w:drawing>
           <wp:inline xmlns:a="http://schemas.openxmlformats.org/drawingml/2006/main" xmlns:pic="http://schemas.openxmlformats.org/drawingml/2006/picture">
             <wp:extent cx="4754880" cy="2563178"/>
-            <wp:docPr id="6" name="Picture 6"/>
+            <wp:docPr id="9" name="Picture 9"/>
             <wp:cNvGraphicFramePr>
               <a:graphicFrameLocks noChangeAspect="1"/>
             </wp:cNvGraphicFramePr>
@@ -1445,7 +1520,7 @@
                     <pic:cNvPicPr/>
                   </pic:nvPicPr>
                   <pic:blipFill>
-                    <a:blip r:embed="rId14"/>
+                    <a:blip r:embed="rId17"/>
                     <a:stretch>
                       <a:fillRect/>
                     </a:stretch>

</xml_diff>

<commit_message>
Embed printed invoice screenshot into Task 4 Word report document (Tugas 4 Complete!)
</commit_message>
<xml_diff>
--- a/Portfolio WP2/4_Unjuk_Kerja Membuat Dokumen Kode Program - Nugraha Jody.docx
+++ b/Portfolio WP2/4_Unjuk_Kerja Membuat Dokumen Kode Program - Nugraha Jody.docx
@@ -1380,13 +1380,38 @@
         <w:jc w:val="center"/>
       </w:pPr>
       <w:r>
-        <w:rPr>
-          <w:rFonts w:ascii="Arial" w:hAnsi="Arial"/>
-          <w:b/>
-          <w:color w:val="EF4444"/>
-          <w:sz w:val="22"/>
-        </w:rPr>
-        <w:t>[ TEMPEL SCREENSHOT: TEMPEL SCREENSHOT HALAMAN NOTA BOOKING SERVIS (INVOICE/STRUK) DI BROWSER DI SINI ]</w:t>
+        <w:drawing>
+          <wp:inline xmlns:a="http://schemas.openxmlformats.org/drawingml/2006/main" xmlns:pic="http://schemas.openxmlformats.org/drawingml/2006/picture">
+            <wp:extent cx="4754880" cy="2521387"/>
+            <wp:docPr id="9" name="Picture 9"/>
+            <wp:cNvGraphicFramePr>
+              <a:graphicFrameLocks noChangeAspect="1"/>
+            </wp:cNvGraphicFramePr>
+            <a:graphic>
+              <a:graphicData uri="http://schemas.openxmlformats.org/drawingml/2006/picture">
+                <pic:pic>
+                  <pic:nvPicPr>
+                    <pic:cNvPr id="0" name="media__1783249020654.png"/>
+                    <pic:cNvPicPr/>
+                  </pic:nvPicPr>
+                  <pic:blipFill>
+                    <a:blip r:embed="rId17"/>
+                    <a:stretch>
+                      <a:fillRect/>
+                    </a:stretch>
+                  </pic:blipFill>
+                  <pic:spPr>
+                    <a:xfrm>
+                      <a:off x="0" y="0"/>
+                      <a:ext cx="4754880" cy="2521387"/>
+                    </a:xfrm>
+                    <a:prstGeom prst="rect"/>
+                  </pic:spPr>
+                </pic:pic>
+              </a:graphicData>
+            </a:graphic>
+          </wp:inline>
+        </w:drawing>
       </w:r>
     </w:p>
     <w:p>
@@ -1398,10 +1423,10 @@
         <w:rPr>
           <w:rFonts w:ascii="Arial" w:hAnsi="Arial"/>
           <w:i/>
-          <w:color w:val="94A3B8"/>
+          <w:color w:val="64748B"/>
           <w:sz w:val="18"/>
         </w:rPr>
-        <w:t>(Silakan ambil screenshot dari kodingan atau browser lokal, lalu tempel di atas)</w:t>
+        <w:t>(Screenshot Output Program untuk Pembuatan View Detail Transaksi (nota_booking.blade.php))</w:t>
       </w:r>
     </w:p>
     <w:p>
@@ -1508,7 +1533,7 @@
         <w:drawing>
           <wp:inline xmlns:a="http://schemas.openxmlformats.org/drawingml/2006/main" xmlns:pic="http://schemas.openxmlformats.org/drawingml/2006/picture">
             <wp:extent cx="4754880" cy="2563178"/>
-            <wp:docPr id="9" name="Picture 9"/>
+            <wp:docPr id="10" name="Picture 10"/>
             <wp:cNvGraphicFramePr>
               <a:graphicFrameLocks noChangeAspect="1"/>
             </wp:cNvGraphicFramePr>
@@ -1520,7 +1545,7 @@
                     <pic:cNvPicPr/>
                   </pic:nvPicPr>
                   <pic:blipFill>
-                    <a:blip r:embed="rId17"/>
+                    <a:blip r:embed="rId18"/>
                     <a:stretch>
                       <a:fillRect/>
                     </a:stretch>

</xml_diff>